<commit_message>
Drop the tech-stack line from the DICTA entry
Remove the tools listing from the DICTA role on both the homepage and the
CV; the research description carries the entry on its own.

Co-Authored-By: Claude Opus 5 <noreply@anthropic.com>
Claude-Session: https://claude.ai/code/session_01SD8bzAZXwLRhGcTMqskKs8
</commit_message>
<xml_diff>
--- a/cv/Moshe_Mash_CV.docx
+++ b/cv/Moshe_Mash_CV.docx
@@ -1139,17 +1139,6 @@
           <w:rFonts w:ascii="Calibri" w:eastAsia="Calibri" w:hAnsi="Calibri"/>
         </w:rPr>
         <w:t>Published prototypes and tools provided academic collaborators with tools enabling automated scholarly insights.</w:t>
-      </w:r>
-    </w:p>
-    <w:p>
-      <w:pPr>
-        <w:numPr>
-          <w:ilvl w:val="0"/>
-          <w:numId w:val="21"/>
-        </w:numPr>
-      </w:pPr>
-      <w:r>
-        <w:t>Tech stack: Python, PyTorch, HuggingFace Transformers, large language models, retrieval-augmented generation (RAG), and classical NLP.</w:t>
       </w:r>
     </w:p>
     <w:p>

</xml_diff>

<commit_message>
Sync the tracked CV Word source with the published PDF
The uploaded source still carried the Research Agenda section. Removing
it reproduces the published six-page PDF word for word.

Co-Authored-By: Claude Opus 5 <noreply@anthropic.com>
Claude-Session: https://claude.ai/code/session_01SD8bzAZXwLRhGcTMqskKs8
</commit_message>
<xml_diff>
--- a/cv/Moshe_Mash_CV.docx
+++ b/cv/Moshe_Mash_CV.docx
@@ -21,7 +21,7 @@
     <w:p>
       <w:r>
         <w:rPr>
-          <w:rFonts w:ascii="Arial" w:hAnsi="Arial"/>
+          <w:rFonts w:ascii="Calibri" w:hAnsi="Calibri"/>
         </w:rPr>
         <w:t xml:space="preserve">moshikmash@gmail.com | +1-412-626-1676 | </w:t>
       </w:r>
@@ -36,7 +36,7 @@
       </w:hyperlink>
       <w:r>
         <w:rPr>
-          <w:rFonts w:ascii="Arial" w:hAnsi="Arial"/>
+          <w:rFonts w:ascii="Calibri" w:hAnsi="Calibri"/>
         </w:rPr>
         <w:t xml:space="preserve"> | </w:t>
       </w:r>
@@ -82,7 +82,7 @@
         </w:numPr>
       </w:pPr>
       <w:r>
-        <w:t>Researcher in multi-agent systems, decision-making, and human-AI interaction. I study how decision-makers, human and artificial, act well individually and together, through game theory, mechanism design, multi-agent systems, human-subjects research, and applied LLMs. Ph.D. in Software and Information Systems Engineering (Ben-Gurion University); postdoctoral fellow at Carnegie Mellon’s Robotics Institute. Recipient of the Best Paper Award at ACM EC 2016 and a Communications of the ACM Research Highlight (2018), with publications in JACM, AIJ, CHI, IJCAI, and Science Translational Medicine. Over a decade of experience translating research into production — built predictive systems at Amdocs saving millions annually, deployed clinical ML models at Diagnostic Robotics, led NLP/LLM research at DICTA, and now founder of MashInnovateAI.</w:t>
+        <w:t>AI researcher specializing in natural language processing and document understanding - extracting structure and meaning from large, unstructured text collections. Over the past year at DICTA I have focused on understanding text at scale: information extraction, document classification, citation and cross-reference detection, semantic search, and question-answering over complex documents, using fine-tuned LLMs and retrieval-augmented generation taken through to production. Ph.D. in Software and Information Systems Engineering (Ben-Gurion University); postdoctoral fellow at Carnegie Mellon's Robotics Institute. Over a decade translating research into production - built predictive systems at Amdocs saving millions annually, deployed clinical ML at Diagnostic Robotics, and now founder of MashInnovateAI. Best Paper Award at ACM EC 2016 and a Communications of the ACM Research Highlight (2018), with publications in JACM, AIJ, CHI, IJCAI, and Science Translational Medicine.</w:t>
       </w:r>
     </w:p>
     <w:p>
@@ -99,7 +99,7 @@
         <w:t xml:space="preserve">Core Skills: </w:t>
       </w:r>
       <w:r>
-        <w:t>Game Theory &amp; Mechanism Design · Multi-Agent Systems · Human-Subjects Experiments · Social Choice &amp; Fair Division algorithms · Markov Decision Processes (MDP) · Reinforcement Learning · Human-Centric AI · Applied AI · AI Research · Natural Language Processing (NLP) · LLM fine-tuning · Retrieval-Augmented Generation (RAG) · Agentic AI · End-to-end delivery (proof of concept → production) · Python · PyTorch · HuggingFace Transformers · Production ML · SQL · Distributed Training · Healthcare &amp; Clinical ML</w:t>
+        <w:t>Natural Language Processing (NLP) · Document &amp; Text Understanding · Information Extraction · Document Classification · Semantic Search &amp; Similarity · Question-Answering over Documents · LLM fine-tuning · Retrieval-Augmented Generation (RAG) · Applied AI · Agentic AI · End-to-end delivery (proof of concept → production) · Python · PyTorch · HuggingFace Transformers · Production ML · SQL · Distributed Training · Multi-Agent Systems · Game Theory &amp; Mechanism Design</w:t>
       </w:r>
     </w:p>
     <w:p>
@@ -134,40 +134,7 @@
           <w:rFonts w:ascii="Calibri" w:eastAsia="Calibri" w:hAnsi="Calibri"/>
         </w:rPr>
         <w:lastRenderedPageBreak/>
-        <w:t>Multi-Agent Systems, Decision-Making, Game Theory and Mechanism Design, Human-AI Interaction, Human-Centric AI, Artificial Intelligence, Machine Learning, Natural Language Processing, Data Science Workflows.</w:t>
-      </w:r>
-    </w:p>
-    <w:p/>
-    <w:p>
-      <w:pPr>
-        <w:rPr>
-          <w:b/>
-          <w:bCs/>
-        </w:rPr>
-      </w:pPr>
-      <w:r>
-        <w:rPr>
-          <w:rFonts w:ascii="Calibri" w:eastAsia="Calibri" w:hAnsi="Calibri"/>
-          <w:b/>
-          <w:bCs/>
-        </w:rPr>
-        <w:t>Research Agenda</w:t>
-      </w:r>
-    </w:p>
-    <w:p>
-      <w:r>
-        <w:rPr>
-          <w:rFonts w:ascii="Calibri" w:eastAsia="Calibri" w:hAnsi="Calibri"/>
-        </w:rPr>
-        <w:t>My research centers on decision-making by self-interested and bounded agents, human and artificial, studied through game theory, mechanism design, multi-agent systems, and human-subjects experiments. I am developing a new direction that extends this to LLM-based agents: learning what an agent should communicate to a human, and how, from human preference, in mixed human-agent settings such as autonomous and human-driven vehicles.</w:t>
-      </w:r>
-    </w:p>
-    <w:p>
-      <w:r>
-        <w:rPr>
-          <w:rFonts w:ascii="Calibri" w:eastAsia="Calibri" w:hAnsi="Calibri"/>
-        </w:rPr>
-        <w:t>My active research applies large language models and modern NLP to high-value text-analysis problems, organized around two directions aimed at peer-reviewed and patentable outcomes: (1) computational analysis of Hebrew and rabbinic texts — authorship attribution, automatic citation generation, and semantic cross-referencing (with DICTA); and (2) computational analysis of legal and patent text, including textual studies of disparate outcomes in the patent system. Both involve fine-tuning LLMs for prediction, clustering, and semantic analysis of domain-specific corpora, and build on prior work spanning multi-agent systems, game theory, and human-centric AI.</w:t>
+        <w:t>Text Understanding, Text Analysis, Natural Language Processing, Multi-Agent Systems, Human-Agent Environments, Decision-Making, Game Theory and Mechanism Design, Human-AI Interaction, Human-Centric AI, Artificial Intelligence, Machine Learning, Data Science Workflows.</w:t>
       </w:r>
     </w:p>
     <w:p>
@@ -403,6 +370,1198 @@
         <w:rPr>
           <w:rFonts w:ascii="Calibri" w:eastAsia="Calibri" w:hAnsi="Calibri"/>
         </w:rPr>
+        <w:pict w14:anchorId="49F94E1B">
+          <v:rect id="_x0000_i1029" style="width:0;height:1.5pt" o:hralign="center" o:hrstd="t" o:hrnoshade="t" o:hr="t" fillcolor="gray" stroked="f"/>
+        </w:pict>
+      </w:r>
+    </w:p>
+    <w:p>
+      <w:pPr>
+        <w:rPr>
+          <w:b/>
+          <w:bCs/>
+        </w:rPr>
+      </w:pPr>
+      <w:r>
+        <w:rPr>
+          <w:rFonts w:ascii="Calibri" w:eastAsia="Calibri" w:hAnsi="Calibri"/>
+          <w:b/>
+          <w:bCs/>
+        </w:rPr>
+        <w:t>Awards &amp; Recognition</w:t>
+      </w:r>
+    </w:p>
+    <w:p>
+      <w:pPr>
+        <w:numPr>
+          <w:ilvl w:val="0"/>
+          <w:numId w:val="26"/>
+        </w:numPr>
+      </w:pPr>
+      <w:r>
+        <w:rPr>
+          <w:rFonts w:ascii="Calibri" w:eastAsia="Calibri" w:hAnsi="Calibri"/>
+          <w:b/>
+          <w:bCs/>
+        </w:rPr>
+        <w:t>Best Paper Award</w:t>
+      </w:r>
+      <w:r>
+        <w:rPr>
+          <w:rFonts w:ascii="Calibri" w:eastAsia="Calibri" w:hAnsi="Calibri"/>
+        </w:rPr>
+        <w:t xml:space="preserve"> – ACM Conference on Economics and Computation (2016)</w:t>
+      </w:r>
+    </w:p>
+    <w:p>
+      <w:pPr>
+        <w:numPr>
+          <w:ilvl w:val="0"/>
+          <w:numId w:val="26"/>
+        </w:numPr>
+      </w:pPr>
+      <w:r>
+        <w:rPr>
+          <w:rFonts w:ascii="Calibri" w:eastAsia="Calibri" w:hAnsi="Calibri"/>
+          <w:b/>
+          <w:bCs/>
+        </w:rPr>
+        <w:t>Communications of the ACM Research Highlight</w:t>
+      </w:r>
+      <w:r>
+        <w:rPr>
+          <w:rFonts w:ascii="Calibri" w:eastAsia="Calibri" w:hAnsi="Calibri"/>
+        </w:rPr>
+        <w:t xml:space="preserve"> – Which Is the Fairest (Rent Division) of Them All? (2018)</w:t>
+      </w:r>
+    </w:p>
+    <w:p>
+      <w:pPr>
+        <w:numPr>
+          <w:ilvl w:val="0"/>
+          <w:numId w:val="26"/>
+        </w:numPr>
+        <w:rPr>
+          <w:bCs/>
+        </w:rPr>
+      </w:pPr>
+      <w:r>
+        <w:rPr>
+          <w:rFonts w:ascii="Calibri" w:eastAsia="Calibri" w:hAnsi="Calibri"/>
+          <w:b/>
+          <w:bCs/>
+        </w:rPr>
+        <w:t>Excellence in Teaching Award</w:t>
+      </w:r>
+      <w:r>
+        <w:rPr>
+          <w:rFonts w:ascii="Calibri" w:eastAsia="Calibri" w:hAnsi="Calibri"/>
+          <w:b/>
+        </w:rPr>
+        <w:t xml:space="preserve"> </w:t>
+      </w:r>
+      <w:r>
+        <w:rPr>
+          <w:rFonts w:ascii="Calibri" w:eastAsia="Calibri" w:hAnsi="Calibri"/>
+          <w:bCs/>
+        </w:rPr>
+        <w:t>– Ben-Gurion University (2016, 2017)</w:t>
+      </w:r>
+    </w:p>
+    <w:p>
+      <w:pPr>
+        <w:numPr>
+          <w:ilvl w:val="0"/>
+          <w:numId w:val="26"/>
+        </w:numPr>
+      </w:pPr>
+      <w:r>
+        <w:rPr>
+          <w:rFonts w:ascii="Calibri" w:eastAsia="Calibri" w:hAnsi="Calibri"/>
+          <w:b/>
+          <w:bCs/>
+        </w:rPr>
+        <w:t>Ph.D. Scholarship for Academic Excellence</w:t>
+      </w:r>
+      <w:r>
+        <w:rPr>
+          <w:rFonts w:ascii="Calibri" w:eastAsia="Calibri" w:hAnsi="Calibri"/>
+        </w:rPr>
+        <w:t xml:space="preserve"> – Ben-Gurion University (2014)</w:t>
+      </w:r>
+    </w:p>
+    <w:p>
+      <w:r>
+        <w:rPr>
+          <w:rFonts w:ascii="Calibri" w:eastAsia="Calibri" w:hAnsi="Calibri"/>
+        </w:rPr>
+        <w:pict w14:anchorId="50DDD9F5">
+          <v:rect id="_x0000_i1026" style="width:0;height:1.5pt" o:hralign="center" o:hrstd="t" o:hrnoshade="t" o:hr="t" fillcolor="gray" stroked="f"/>
+        </w:pict>
+      </w:r>
+    </w:p>
+    <w:p>
+      <w:pPr>
+        <w:rPr>
+          <w:b/>
+          <w:bCs/>
+        </w:rPr>
+      </w:pPr>
+      <w:r>
+        <w:rPr>
+          <w:rFonts w:ascii="Calibri" w:eastAsia="Calibri" w:hAnsi="Calibri"/>
+          <w:b/>
+          <w:bCs/>
+        </w:rPr>
+        <w:t>Academic Positions</w:t>
+      </w:r>
+    </w:p>
+    <w:p>
+      <w:r>
+        <w:rPr>
+          <w:rFonts w:ascii="Calibri" w:eastAsia="Calibri" w:hAnsi="Calibri"/>
+          <w:b/>
+          <w:bCs/>
+        </w:rPr>
+        <w:t>Postdoctoral Researcher</w:t>
+      </w:r>
+      <w:r>
+        <w:rPr>
+          <w:rFonts w:ascii="Calibri" w:eastAsia="Calibri" w:hAnsi="Calibri"/>
+        </w:rPr>
+        <w:t xml:space="preserve"> | </w:t>
+      </w:r>
+      <w:r>
+        <w:rPr>
+          <w:rFonts w:ascii="Calibri" w:eastAsia="Calibri" w:hAnsi="Calibri"/>
+          <w:b/>
+          <w:bCs/>
+        </w:rPr>
+        <w:t>Carnegie Mellon University, Robotics Institute</w:t>
+      </w:r>
+      <w:r>
+        <w:rPr>
+          <w:rFonts w:ascii="Calibri" w:eastAsia="Calibri" w:hAnsi="Calibri"/>
+        </w:rPr>
+        <w:t xml:space="preserve"> | </w:t>
+      </w:r>
+      <w:r>
+        <w:rPr>
+          <w:rFonts w:ascii="Calibri" w:eastAsia="Calibri" w:hAnsi="Calibri"/>
+          <w:b/>
+          <w:bCs/>
+        </w:rPr>
+        <w:t>2019–2022</w:t>
+      </w:r>
+    </w:p>
+    <w:p>
+      <w:pPr>
+        <w:numPr>
+          <w:ilvl w:val="0"/>
+          <w:numId w:val="21"/>
+        </w:numPr>
+      </w:pPr>
+      <w:r>
+        <w:t xml:space="preserve">Hosted by </w:t>
+      </w:r>
+      <w:r>
+        <w:t>Prof. Reid Simmons</w:t>
+      </w:r>
+      <w:r>
+        <w:t xml:space="preserve"> and </w:t>
+      </w:r>
+      <w:r>
+        <w:t>Dr. Stephanie Rosenthal</w:t>
+      </w:r>
+      <w:r>
+        <w:t>.</w:t>
+      </w:r>
+    </w:p>
+    <w:p>
+      <w:pPr>
+        <w:numPr>
+          <w:ilvl w:val="0"/>
+          <w:numId w:val="22"/>
+        </w:numPr>
+      </w:pPr>
+      <w:r>
+        <w:rPr>
+          <w:rFonts w:ascii="Calibri" w:eastAsia="Calibri" w:hAnsi="Calibri"/>
+        </w:rPr>
+        <w:lastRenderedPageBreak/>
+        <w:t>Conducted research on the behavior and cognitive processes of machine learning practitioners as they develop AI models.</w:t>
+      </w:r>
+    </w:p>
+    <w:p>
+      <w:pPr>
+        <w:numPr>
+          <w:ilvl w:val="0"/>
+          <w:numId w:val="22"/>
+        </w:numPr>
+      </w:pPr>
+      <w:r>
+        <w:rPr>
+          <w:rFonts w:ascii="Calibri" w:eastAsia="Calibri" w:hAnsi="Calibri"/>
+        </w:rPr>
+        <w:t>Designed frameworks to capture, model, and analyze workflows, with emphasis on decision-making, iteration cycles, and knowledge bottlenecks.</w:t>
+      </w:r>
+    </w:p>
+    <w:p>
+      <w:pPr>
+        <w:numPr>
+          <w:ilvl w:val="0"/>
+          <w:numId w:val="22"/>
+        </w:numPr>
+      </w:pPr>
+      <w:r>
+        <w:rPr>
+          <w:rFonts w:ascii="Calibri" w:eastAsia="Calibri" w:hAnsi="Calibri"/>
+        </w:rPr>
+        <w:t>Developed predictive methods to identify critical moments of difficulty (“stuckness”) in ML development, enabling targeted support and improved productivity.</w:t>
+      </w:r>
+    </w:p>
+    <w:p>
+      <w:pPr>
+        <w:numPr>
+          <w:ilvl w:val="0"/>
+          <w:numId w:val="22"/>
+        </w:numPr>
+      </w:pPr>
+      <w:r>
+        <w:rPr>
+          <w:rFonts w:ascii="Calibri" w:eastAsia="Calibri" w:hAnsi="Calibri"/>
+        </w:rPr>
+        <w:t>Collaborated with multidisciplinary teams to integrate human-centric AI approaches into machine learning tools and environments.</w:t>
+      </w:r>
+    </w:p>
+    <w:p>
+      <w:pPr>
+        <w:numPr>
+          <w:ilvl w:val="0"/>
+          <w:numId w:val="22"/>
+        </w:numPr>
+      </w:pPr>
+      <w:r>
+        <w:rPr>
+          <w:rFonts w:ascii="Calibri" w:eastAsia="Calibri" w:hAnsi="Calibri"/>
+        </w:rPr>
+        <w:t>Mentored students in AI and human-computer interaction research.</w:t>
+      </w:r>
+    </w:p>
+    <w:p>
+      <w:pPr>
+        <w:numPr>
+          <w:ilvl w:val="0"/>
+          <w:numId w:val="22"/>
+        </w:numPr>
+      </w:pPr>
+      <w:r>
+        <w:rPr>
+          <w:rFonts w:ascii="Calibri" w:eastAsia="Calibri" w:hAnsi="Calibri"/>
+        </w:rPr>
+        <w:t>Research funded by J.P. Morgan, which renewed the award for a second consecutive year based on the project's strong results.</w:t>
+      </w:r>
+    </w:p>
+    <w:p>
+      <w:r>
+        <w:rPr>
+          <w:rFonts w:ascii="Calibri" w:eastAsia="Calibri" w:hAnsi="Calibri"/>
+          <w:b/>
+          <w:bCs/>
+        </w:rPr>
+        <w:t>Research Assistant</w:t>
+      </w:r>
+      <w:r>
+        <w:rPr>
+          <w:rFonts w:ascii="Calibri" w:eastAsia="Calibri" w:hAnsi="Calibri"/>
+        </w:rPr>
+        <w:t xml:space="preserve"> | </w:t>
+      </w:r>
+      <w:r>
+        <w:rPr>
+          <w:rFonts w:ascii="Calibri" w:eastAsia="Calibri" w:hAnsi="Calibri"/>
+          <w:b/>
+          <w:bCs/>
+        </w:rPr>
+        <w:t>Weizmann Institute of Science</w:t>
+      </w:r>
+      <w:r>
+        <w:rPr>
+          <w:rFonts w:ascii="Calibri" w:eastAsia="Calibri" w:hAnsi="Calibri"/>
+        </w:rPr>
+        <w:t xml:space="preserve"> | </w:t>
+      </w:r>
+      <w:r>
+        <w:rPr>
+          <w:rFonts w:ascii="Calibri" w:eastAsia="Calibri" w:hAnsi="Calibri"/>
+          <w:b/>
+          <w:bCs/>
+        </w:rPr>
+        <w:t>2011–2012</w:t>
+      </w:r>
+    </w:p>
+    <w:p>
+      <w:pPr>
+        <w:numPr>
+          <w:ilvl w:val="0"/>
+          <w:numId w:val="23"/>
+        </w:numPr>
+      </w:pPr>
+      <w:r>
+        <w:rPr>
+          <w:rFonts w:ascii="Calibri" w:eastAsia="Calibri" w:hAnsi="Calibri"/>
+        </w:rPr>
+        <w:t>Developed image-processing algorithms for 3D biomedical images.</w:t>
+      </w:r>
+    </w:p>
+    <w:p>
+      <w:r>
+        <w:rPr>
+          <w:rFonts w:ascii="Calibri" w:eastAsia="Calibri" w:hAnsi="Calibri"/>
+        </w:rPr>
+        <w:pict w14:anchorId="69FF5FEC">
+          <v:rect id="_x0000_i1027" style="width:0;height:1.5pt" o:hralign="center" o:hrstd="t" o:hrnoshade="t" o:hr="t" fillcolor="gray" stroked="f"/>
+        </w:pict>
+      </w:r>
+    </w:p>
+    <w:p>
+      <w:pPr>
+        <w:rPr>
+          <w:b/>
+          <w:bCs/>
+        </w:rPr>
+      </w:pPr>
+      <w:r>
+        <w:rPr>
+          <w:rFonts w:ascii="Calibri" w:eastAsia="Calibri" w:hAnsi="Calibri"/>
+          <w:b/>
+          <w:bCs/>
+        </w:rPr>
+        <w:t>Industry Research Positions</w:t>
+      </w:r>
+    </w:p>
+    <w:p>
+      <w:pPr>
+        <w:rPr>
+          <w:b/>
+          <w:bCs/>
+        </w:rPr>
+      </w:pPr>
+      <w:r>
+        <w:rPr>
+          <w:b/>
+          <w:bCs/>
+        </w:rPr>
+        <w:t>Principal AI Researcher &amp; Founder | MashInnovateAI | 2024–present</w:t>
+      </w:r>
+    </w:p>
+    <w:p>
+      <w:pPr>
+        <w:numPr>
+          <w:ilvl w:val="0"/>
+          <w:numId w:val="21"/>
+        </w:numPr>
+      </w:pPr>
+      <w:r>
+        <w:t>Independent AI research &amp; development consultancy delivering end-to-end custom AI systems - NLP, LLM fine-tuning, RAG, agentic and multi-agent LLM systems, and applied ML - from proof of concept to production deployment for research and industry partners.</w:t>
+      </w:r>
+    </w:p>
+    <w:p>
+      <w:pPr>
+        <w:numPr>
+          <w:ilvl w:val="0"/>
+          <w:numId w:val="21"/>
+        </w:numPr>
+      </w:pPr>
+      <w:r>
+        <w:t xml:space="preserve">Clients include startups, established companies looking to integrate AI into their products and workflows, and universities and academic research groups.</w:t>
+      </w:r>
+    </w:p>
+    <w:p>
+      <w:pPr>
+        <w:rPr>
+          <w:b/>
+          <w:bCs/>
+        </w:rPr>
+      </w:pPr>
+      <w:r>
+        <w:rPr>
+          <w:b/>
+          <w:bCs/>
+        </w:rPr>
+        <w:t>AI Researcher | DICTA – The Israel Center for Text Analysis | 2022–present</w:t>
+      </w:r>
+    </w:p>
+    <w:p>
+      <w:pPr>
+        <w:numPr>
+          <w:ilvl w:val="0"/>
+          <w:numId w:val="21"/>
+        </w:numPr>
+      </w:pPr>
+      <w:r>
+        <w:rPr>
+          <w:rFonts w:ascii="Calibri" w:eastAsia="Calibri" w:hAnsi="Calibri"/>
+        </w:rPr>
+        <w:t>Lead text-understanding research over large, unstructured Hebrew and rabbinic document collections - turning raw text into structured, searchable, analyzable data.</w:t>
+      </w:r>
+    </w:p>
+    <w:p>
+      <w:pPr>
+        <w:numPr>
+          <w:ilvl w:val="0"/>
+          <w:numId w:val="21"/>
+        </w:numPr>
+      </w:pPr>
+      <w:r>
+        <w:rPr>
+          <w:rFonts w:ascii="Calibri" w:eastAsia="Calibri" w:hAnsi="Calibri"/>
+        </w:rPr>
+        <w:t xml:space="preserve">Built systems and deep-learning models for in-depth analysis of text - morphological, syntactic, and semantic understanding of long, complex documents at scale.</w:t>
+      </w:r>
+    </w:p>
+    <w:p>
+      <w:pPr>
+        <w:numPr>
+          <w:ilvl w:val="0"/>
+          <w:numId w:val="21"/>
+        </w:numPr>
+      </w:pPr>
+      <w:r>
+        <w:rPr>
+          <w:rFonts w:ascii="Calibri" w:eastAsia="Calibri" w:hAnsi="Calibri"/>
+        </w:rPr>
+        <w:lastRenderedPageBreak/>
+        <w:t>Built NLP models for authorship attribution and document classification - predicting the author of texts with historically disputed attribution from textual signals alone.</w:t>
+      </w:r>
+    </w:p>
+    <w:p>
+      <w:pPr>
+        <w:numPr>
+          <w:ilvl w:val="0"/>
+          <w:numId w:val="21"/>
+        </w:numPr>
+      </w:pPr>
+      <w:r>
+        <w:rPr>
+          <w:rFonts w:ascii="Calibri" w:eastAsia="Calibri" w:hAnsi="Calibri"/>
+        </w:rPr>
+        <w:t>Reached high predictive accuracy and applied these models to resolve long-debated questions of authorship, demonstrating reliable classification of ambiguous documents at scale.</w:t>
+      </w:r>
+    </w:p>
+    <w:p>
+      <w:pPr>
+        <w:numPr>
+          <w:ilvl w:val="0"/>
+          <w:numId w:val="21"/>
+        </w:numPr>
+      </w:pPr>
+      <w:r>
+        <w:rPr>
+          <w:rFonts w:ascii="Calibri" w:eastAsia="Calibri" w:hAnsi="Calibri"/>
+        </w:rPr>
+        <w:t>Designed systems for automatic citation detection, extraction, and cross-referencing of sources across a large document corpus.</w:t>
+      </w:r>
+    </w:p>
+    <w:p>
+      <w:pPr>
+        <w:numPr>
+          <w:ilvl w:val="0"/>
+          <w:numId w:val="21"/>
+        </w:numPr>
+      </w:pPr>
+      <w:r>
+        <w:rPr>
+          <w:rFonts w:ascii="Calibri" w:eastAsia="Calibri" w:hAnsi="Calibri"/>
+        </w:rPr>
+        <w:t>Built LLM-based tools for information extraction, semantic search, text similarity, clustering, and question-answering over documents - training custom text embeddings with contrastive learning and fine-tuning LLMs for domain-specific corpora.</w:t>
+      </w:r>
+    </w:p>
+    <w:p>
+      <w:pPr>
+        <w:numPr>
+          <w:ilvl w:val="0"/>
+          <w:numId w:val="21"/>
+        </w:numPr>
+      </w:pPr>
+      <w:r>
+        <w:rPr>
+          <w:rFonts w:ascii="Calibri" w:eastAsia="Calibri" w:hAnsi="Calibri"/>
+        </w:rPr>
+        <w:t xml:space="preserve">Built end-to-end systems for model training and inference, with tooling to analyze model outcomes and inspect the training process itself.</w:t>
+      </w:r>
+    </w:p>
+    <w:p>
+      <w:pPr>
+        <w:numPr>
+          <w:ilvl w:val="0"/>
+          <w:numId w:val="21"/>
+        </w:numPr>
+      </w:pPr>
+      <w:r>
+        <w:rPr>
+          <w:rFonts w:ascii="Calibri" w:eastAsia="Calibri" w:hAnsi="Calibri"/>
+        </w:rPr>
+        <w:t>Took models from research through to production deployment, delivering document-understanding systems actively used for live analysis of large text collections.</w:t>
+      </w:r>
+    </w:p>
+    <w:p>
+      <w:r>
+        <w:rPr>
+          <w:rFonts w:ascii="Calibri" w:eastAsia="Calibri" w:hAnsi="Calibri"/>
+          <w:b/>
+          <w:bCs/>
+        </w:rPr>
+        <w:t>AI Researcher</w:t>
+      </w:r>
+      <w:r>
+        <w:rPr>
+          <w:rFonts w:ascii="Calibri" w:eastAsia="Calibri" w:hAnsi="Calibri"/>
+        </w:rPr>
+        <w:t xml:space="preserve"> | </w:t>
+      </w:r>
+      <w:r>
+        <w:rPr>
+          <w:rFonts w:ascii="Calibri" w:eastAsia="Calibri" w:hAnsi="Calibri"/>
+          <w:b/>
+          <w:bCs/>
+        </w:rPr>
+        <w:t>Diagnostic Robotics</w:t>
+      </w:r>
+      <w:r>
+        <w:rPr>
+          <w:rFonts w:ascii="Calibri" w:eastAsia="Calibri" w:hAnsi="Calibri"/>
+        </w:rPr>
+        <w:t xml:space="preserve"> | </w:t>
+      </w:r>
+      <w:r>
+        <w:rPr>
+          <w:rFonts w:ascii="Calibri" w:eastAsia="Calibri" w:hAnsi="Calibri"/>
+          <w:b/>
+          <w:bCs/>
+        </w:rPr>
+        <w:t>2019</w:t>
+      </w:r>
+    </w:p>
+    <w:p>
+      <w:pPr>
+        <w:numPr>
+          <w:ilvl w:val="0"/>
+          <w:numId w:val="24"/>
+        </w:numPr>
+      </w:pPr>
+      <w:r>
+        <w:rPr>
+          <w:rFonts w:ascii="Calibri" w:eastAsia="Calibri" w:hAnsi="Calibri"/>
+        </w:rPr>
+        <w:t>Developed machine learning models for the healthcare domain, with applications in risk prediction (e.g., ER diagnoses, hospitalization forecasting).</w:t>
+      </w:r>
+    </w:p>
+    <w:p>
+      <w:pPr>
+        <w:numPr>
+          <w:ilvl w:val="0"/>
+          <w:numId w:val="24"/>
+        </w:numPr>
+      </w:pPr>
+      <w:r>
+        <w:rPr>
+          <w:rFonts w:ascii="Calibri" w:eastAsia="Calibri" w:hAnsi="Calibri"/>
+        </w:rPr>
+        <w:t>Collaborated with clinicians and researchers to refine AI-driven predictive healthcare decision-support systems.</w:t>
+      </w:r>
+    </w:p>
+    <w:p>
+      <w:pPr>
+        <w:numPr>
+          <w:ilvl w:val="0"/>
+          <w:numId w:val="21"/>
+        </w:numPr>
+      </w:pPr>
+      <w:r>
+        <w:t>Tech stack: Python, scikit-learn, and clinical/EHR data pipelines.</w:t>
+      </w:r>
+    </w:p>
+    <w:p>
+      <w:r>
+        <w:rPr>
+          <w:rFonts w:ascii="Calibri" w:eastAsia="Calibri" w:hAnsi="Calibri"/>
+          <w:b/>
+          <w:bCs/>
+        </w:rPr>
+        <w:t>AI Researcher</w:t>
+      </w:r>
+      <w:r>
+        <w:rPr>
+          <w:rFonts w:ascii="Calibri" w:eastAsia="Calibri" w:hAnsi="Calibri"/>
+        </w:rPr>
+        <w:t xml:space="preserve"> | </w:t>
+      </w:r>
+      <w:r>
+        <w:rPr>
+          <w:rFonts w:ascii="Calibri" w:eastAsia="Calibri" w:hAnsi="Calibri"/>
+          <w:b/>
+          <w:bCs/>
+        </w:rPr>
+        <w:t>Amdocs</w:t>
+      </w:r>
+      <w:r>
+        <w:rPr>
+          <w:rFonts w:ascii="Calibri" w:eastAsia="Calibri" w:hAnsi="Calibri"/>
+        </w:rPr>
+        <w:t xml:space="preserve"> | </w:t>
+      </w:r>
+      <w:r>
+        <w:rPr>
+          <w:rFonts w:ascii="Calibri" w:eastAsia="Calibri" w:hAnsi="Calibri"/>
+          <w:b/>
+          <w:bCs/>
+        </w:rPr>
+        <w:t>2018–2019</w:t>
+      </w:r>
+    </w:p>
+    <w:p>
+      <w:pPr>
+        <w:numPr>
+          <w:ilvl w:val="0"/>
+          <w:numId w:val="25"/>
+        </w:numPr>
+      </w:pPr>
+      <w:r>
+        <w:rPr>
+          <w:rFonts w:ascii="Calibri" w:eastAsia="Calibri" w:hAnsi="Calibri"/>
+        </w:rPr>
+        <w:t>Led the development of an innovative system predicting at-risk maintenance contract renewals, saving the company millions of dollars and still in operational use years later.</w:t>
+      </w:r>
+    </w:p>
+    <w:p>
+      <w:pPr>
+        <w:numPr>
+          <w:ilvl w:val="0"/>
+          <w:numId w:val="25"/>
+        </w:numPr>
+      </w:pPr>
+      <w:r>
+        <w:rPr>
+          <w:rFonts w:ascii="Calibri" w:eastAsia="Calibri" w:hAnsi="Calibri"/>
+        </w:rPr>
+        <w:t>Designed, built, and deployed the system from scratch, including problem definition, algorithm design, evaluation, and deployment pipeline.</w:t>
+      </w:r>
+    </w:p>
+    <w:p>
+      <w:pPr>
+        <w:numPr>
+          <w:ilvl w:val="0"/>
+          <w:numId w:val="21"/>
+        </w:numPr>
+      </w:pPr>
+      <w:r>
+        <w:t>Tech stack: Python, scikit-learn, SQL, and a production deployment pipeline.</w:t>
+      </w:r>
+    </w:p>
+    <w:p>
+      <w:r>
+        <w:rPr>
+          <w:rFonts w:ascii="Calibri" w:eastAsia="Calibri" w:hAnsi="Calibri"/>
+        </w:rPr>
+        <w:pict w14:anchorId="7C3638CC">
+          <v:rect id="_x0000_i1030" style="width:0;height:1.5pt" o:hralign="center" o:hrstd="t" o:hrnoshade="t" o:hr="t" fillcolor="gray" stroked="f"/>
+        </w:pict>
+      </w:r>
+    </w:p>
+    <w:p>
+      <w:pPr>
+        <w:rPr>
+          <w:b/>
+          <w:bCs/>
+        </w:rPr>
+      </w:pPr>
+      <w:r>
+        <w:rPr>
+          <w:rFonts w:ascii="Calibri" w:eastAsia="Calibri" w:hAnsi="Calibri"/>
+          <w:b/>
+          <w:bCs/>
+        </w:rPr>
+        <w:t>Teaching &amp; Advising</w:t>
+      </w:r>
+    </w:p>
+    <w:p>
+      <w:r>
+        <w:rPr>
+          <w:rFonts w:ascii="Calibri" w:eastAsia="Calibri" w:hAnsi="Calibri"/>
+          <w:b/>
+          <w:bCs/>
+        </w:rPr>
+        <w:t>Ben-Gurion University of the Negev – Software and Information Systems Engineering Dept.</w:t>
+      </w:r>
+    </w:p>
+    <w:p>
+      <w:pPr>
+        <w:numPr>
+          <w:ilvl w:val="0"/>
+          <w:numId w:val="27"/>
+        </w:numPr>
+        <w:rPr>
+          <w:bCs/>
+        </w:rPr>
+      </w:pPr>
+      <w:r>
+        <w:rPr>
+          <w:rFonts w:ascii="Calibri" w:eastAsia="Calibri" w:hAnsi="Calibri"/>
+          <w:bCs/>
+        </w:rPr>
+        <w:t>Teaching Assistant, Databases – Fall–Spring 2016, 2017, 2018</w:t>
+      </w:r>
+    </w:p>
+    <w:p>
+      <w:pPr>
+        <w:numPr>
+          <w:ilvl w:val="0"/>
+          <w:numId w:val="27"/>
+        </w:numPr>
+        <w:rPr>
+          <w:bCs/>
+        </w:rPr>
+      </w:pPr>
+      <w:r>
+        <w:rPr>
+          <w:rFonts w:ascii="Calibri" w:eastAsia="Calibri" w:hAnsi="Calibri"/>
+          <w:bCs/>
+        </w:rPr>
+        <w:t>Teaching Assistant, Analysis and Design of Software Systems – Spring–Summer 2016, 2017, 2018</w:t>
+      </w:r>
+    </w:p>
+    <w:p>
+      <w:pPr>
+        <w:numPr>
+          <w:ilvl w:val="0"/>
+          <w:numId w:val="27"/>
+        </w:numPr>
+        <w:rPr>
+          <w:bCs/>
+        </w:rPr>
+      </w:pPr>
+      <w:r>
+        <w:rPr>
+          <w:rFonts w:ascii="Calibri" w:eastAsia="Calibri" w:hAnsi="Calibri"/>
+          <w:bCs/>
+        </w:rPr>
+        <w:t>Teaching Assistant, Intelligent Systems – Spring–Summer 2015</w:t>
+      </w:r>
+    </w:p>
+    <w:p>
+      <w:pPr>
+        <w:numPr>
+          <w:ilvl w:val="0"/>
+          <w:numId w:val="27"/>
+        </w:numPr>
+        <w:rPr>
+          <w:bCs/>
+        </w:rPr>
+      </w:pPr>
+      <w:r>
+        <w:rPr>
+          <w:rFonts w:ascii="Calibri" w:eastAsia="Calibri" w:hAnsi="Calibri"/>
+          <w:bCs/>
+        </w:rPr>
+        <w:t>Teaching Assistant, Decision Support Systems – Fall–Spring 2015</w:t>
+      </w:r>
+    </w:p>
+    <w:p>
+      <w:pPr>
+        <w:numPr>
+          <w:ilvl w:val="0"/>
+          <w:numId w:val="27"/>
+        </w:numPr>
+      </w:pPr>
+      <w:r>
+        <w:rPr>
+          <w:rFonts w:ascii="Calibri" w:eastAsia="Calibri" w:hAnsi="Calibri"/>
+        </w:rPr>
+        <w:t>Departmental Seminar Coordinator – 2015, 2016, 2017, 2018</w:t>
+      </w:r>
+    </w:p>
+    <w:p>
+      <w:pPr>
+        <w:numPr>
+          <w:ilvl w:val="0"/>
+          <w:numId w:val="27"/>
+        </w:numPr>
+      </w:pPr>
+      <w:r>
+        <w:rPr>
+          <w:rFonts w:ascii="Calibri" w:eastAsia="Calibri" w:hAnsi="Calibri"/>
+        </w:rPr>
+        <w:t>Final Projects Coordinator (4th Year) – 2015, 2016, 2017, 2018</w:t>
+      </w:r>
+    </w:p>
+    <w:p>
+      <w:pPr>
+        <w:numPr>
+          <w:ilvl w:val="0"/>
+          <w:numId w:val="27"/>
+        </w:numPr>
+      </w:pPr>
+      <w:r>
+        <w:rPr>
+          <w:rFonts w:ascii="Calibri" w:eastAsia="Calibri" w:hAnsi="Calibri"/>
+        </w:rPr>
+        <w:t>Final Projects Adviser (Undergraduate) – 2015, 2016</w:t>
+      </w:r>
+    </w:p>
+    <w:p>
+      <w:r>
+        <w:rPr>
+          <w:rFonts w:ascii="Calibri" w:eastAsia="Calibri" w:hAnsi="Calibri"/>
+          <w:b/>
+          <w:bCs/>
+        </w:rPr>
+        <w:t>Tel-Aviv Yafo Academic College – Information Systems Dept.</w:t>
+      </w:r>
+    </w:p>
+    <w:p>
+      <w:pPr>
+        <w:numPr>
+          <w:ilvl w:val="0"/>
+          <w:numId w:val="28"/>
+        </w:numPr>
+      </w:pPr>
+      <w:r>
+        <w:rPr>
+          <w:rFonts w:ascii="Calibri" w:eastAsia="Calibri" w:hAnsi="Calibri"/>
+        </w:rPr>
+        <w:t>Professor, Databases – Spring–Summer 2015, Fall–Spring 2015</w:t>
+      </w:r>
+    </w:p>
+    <w:p>
+      <w:pPr>
+        <w:numPr>
+          <w:ilvl w:val="0"/>
+          <w:numId w:val="28"/>
+        </w:numPr>
+      </w:pPr>
+      <w:r>
+        <w:rPr>
+          <w:rFonts w:ascii="Calibri" w:eastAsia="Calibri" w:hAnsi="Calibri"/>
+        </w:rPr>
+        <w:lastRenderedPageBreak/>
+        <w:t>Lecturer, Game Theory – Spring–Summer 2015</w:t>
+      </w:r>
+    </w:p>
+    <w:p>
+      <w:pPr>
+        <w:numPr>
+          <w:ilvl w:val="0"/>
+          <w:numId w:val="28"/>
+        </w:numPr>
+        <w:rPr>
+          <w:bCs/>
+        </w:rPr>
+      </w:pPr>
+      <w:r>
+        <w:rPr>
+          <w:rFonts w:ascii="Calibri" w:eastAsia="Calibri" w:hAnsi="Calibri"/>
+          <w:bCs/>
+        </w:rPr>
+        <w:t>Teaching Assistant, Databases – Spring–Summer 2014</w:t>
+      </w:r>
+    </w:p>
+    <w:p>
+      <w:r>
+        <w:rPr>
+          <w:rFonts w:ascii="Calibri" w:eastAsia="Calibri" w:hAnsi="Calibri"/>
+          <w:b/>
+          <w:bCs/>
+        </w:rPr>
+        <w:t>Bar-Ilan University</w:t>
+      </w:r>
+    </w:p>
+    <w:p>
+      <w:pPr>
+        <w:numPr>
+          <w:ilvl w:val="0"/>
+          <w:numId w:val="29"/>
+        </w:numPr>
+        <w:rPr>
+          <w:bCs/>
+        </w:rPr>
+      </w:pPr>
+      <w:r>
+        <w:rPr>
+          <w:rFonts w:ascii="Calibri" w:eastAsia="Calibri" w:hAnsi="Calibri"/>
+          <w:bCs/>
+        </w:rPr>
+        <w:t>Teaching Assistant, Statistical Methods in Computer Science – Spring–Summer 2014</w:t>
+      </w:r>
+    </w:p>
+    <w:p>
+      <w:pPr>
+        <w:numPr>
+          <w:ilvl w:val="0"/>
+          <w:numId w:val="29"/>
+        </w:numPr>
+        <w:rPr>
+          <w:bCs/>
+        </w:rPr>
+      </w:pPr>
+      <w:r>
+        <w:rPr>
+          <w:rFonts w:ascii="Calibri" w:eastAsia="Calibri" w:hAnsi="Calibri"/>
+          <w:bCs/>
+        </w:rPr>
+        <w:t>Teaching Assistant, Object-Oriented Programming – Fall–Spring 2013, 2014</w:t>
+      </w:r>
+    </w:p>
+    <w:p>
+      <w:pPr>
+        <w:numPr>
+          <w:ilvl w:val="0"/>
+          <w:numId w:val="29"/>
+        </w:numPr>
+        <w:rPr>
+          <w:bCs/>
+        </w:rPr>
+      </w:pPr>
+      <w:r>
+        <w:rPr>
+          <w:rFonts w:ascii="Calibri" w:eastAsia="Calibri" w:hAnsi="Calibri"/>
+          <w:bCs/>
+        </w:rPr>
+        <w:t>Teaching Assistant, Machine Learning – Fall–Spring 2014</w:t>
+      </w:r>
+    </w:p>
+    <w:p>
+      <w:pPr>
+        <w:numPr>
+          <w:ilvl w:val="0"/>
+          <w:numId w:val="29"/>
+        </w:numPr>
+        <w:rPr>
+          <w:bCs/>
+        </w:rPr>
+      </w:pPr>
+      <w:r>
+        <w:rPr>
+          <w:rFonts w:ascii="Calibri" w:eastAsia="Calibri" w:hAnsi="Calibri"/>
+          <w:bCs/>
+        </w:rPr>
+        <w:t>Teaching Assistant, Introduction to Computing – Fall–Spring 2013</w:t>
+      </w:r>
+    </w:p>
+    <w:p>
+      <w:r>
+        <w:rPr>
+          <w:rFonts w:ascii="Calibri" w:eastAsia="Calibri" w:hAnsi="Calibri"/>
+          <w:b/>
+          <w:bCs/>
+        </w:rPr>
+        <w:t>Shenkar College of Engineering and Design</w:t>
+      </w:r>
+    </w:p>
+    <w:p>
+      <w:pPr>
+        <w:numPr>
+          <w:ilvl w:val="0"/>
+          <w:numId w:val="30"/>
+        </w:numPr>
+        <w:rPr>
+          <w:bCs/>
+        </w:rPr>
+      </w:pPr>
+      <w:r>
+        <w:rPr>
+          <w:rFonts w:ascii="Calibri" w:eastAsia="Calibri" w:hAnsi="Calibri"/>
+          <w:bCs/>
+        </w:rPr>
+        <w:t>Teaching Assistant, Introduction to Programming Systems – Spring–Summer 2012</w:t>
+      </w:r>
+    </w:p>
+    <w:p>
+      <w:pPr>
+        <w:numPr>
+          <w:ilvl w:val="0"/>
+          <w:numId w:val="30"/>
+        </w:numPr>
+        <w:rPr>
+          <w:bCs/>
+        </w:rPr>
+      </w:pPr>
+      <w:r>
+        <w:rPr>
+          <w:rFonts w:ascii="Calibri" w:eastAsia="Calibri" w:hAnsi="Calibri"/>
+          <w:bCs/>
+        </w:rPr>
+        <w:t>Teaching Assistant, Introduction to Computer Science – Fall–Spring 2012</w:t>
+      </w:r>
+    </w:p>
+    <w:p>
+      <w:pPr>
+        <w:numPr>
+          <w:ilvl w:val="0"/>
+          <w:numId w:val="30"/>
+        </w:numPr>
+        <w:rPr>
+          <w:bCs/>
+        </w:rPr>
+      </w:pPr>
+      <w:r>
+        <w:rPr>
+          <w:rFonts w:ascii="Calibri" w:eastAsia="Calibri" w:hAnsi="Calibri"/>
+          <w:bCs/>
+        </w:rPr>
+        <w:t>Teaching Assistant, Introduction to Object-Oriented Programming – Fall–Spring 2012</w:t>
+      </w:r>
+    </w:p>
+    <w:p>
+      <w:r>
+        <w:rPr>
+          <w:rFonts w:ascii="Calibri" w:eastAsia="Calibri" w:hAnsi="Calibri"/>
+          <w:b/>
+          <w:bCs/>
+        </w:rPr>
+        <w:t>College of Management (Academic)</w:t>
+      </w:r>
+    </w:p>
+    <w:p>
+      <w:pPr>
+        <w:numPr>
+          <w:ilvl w:val="0"/>
+          <w:numId w:val="31"/>
+        </w:numPr>
+        <w:rPr>
+          <w:bCs/>
+        </w:rPr>
+      </w:pPr>
+      <w:r>
+        <w:rPr>
+          <w:rFonts w:ascii="Calibri" w:eastAsia="Calibri" w:hAnsi="Calibri"/>
+          <w:bCs/>
+        </w:rPr>
+        <w:t>Teaching Assistant, Object-Oriented Programming – Spring–Summer 2012</w:t>
+      </w:r>
+    </w:p>
+    <w:p>
+      <w:pPr>
+        <w:rPr>
+          <w:b/>
+          <w:bCs/>
+        </w:rPr>
+      </w:pPr>
+      <w:r>
+        <w:rPr>
+          <w:rFonts w:ascii="Calibri" w:eastAsia="Calibri" w:hAnsi="Calibri"/>
+          <w:b/>
+          <w:bCs/>
+        </w:rPr>
+        <w:t>High School Teaching (Israel Ministry of Education)</w:t>
+      </w:r>
+    </w:p>
+    <w:p>
+      <w:pPr>
+        <w:numPr>
+          <w:ilvl w:val="0"/>
+          <w:numId w:val="32"/>
+        </w:numPr>
+      </w:pPr>
+      <w:r>
+        <w:rPr>
+          <w:rFonts w:ascii="Calibri" w:eastAsia="Calibri" w:hAnsi="Calibri"/>
+        </w:rPr>
+        <w:t>Mathematics Teacher (2010–2013) – taught Bagrut levels 3–5 points, specializing in students with learning disabilities (via Nitzan Association).</w:t>
+      </w:r>
+    </w:p>
+    <w:p>
+      <w:r>
+        <w:rPr>
+          <w:rFonts w:ascii="Calibri" w:eastAsia="Calibri" w:hAnsi="Calibri"/>
+        </w:rPr>
+        <w:pict w14:anchorId="472DE5E4">
+          <v:rect id="_x0000_i1031" style="width:0;height:1.5pt" o:hralign="center" o:hrstd="t" o:hrnoshade="t" o:hr="t" fillcolor="gray" stroked="f"/>
+        </w:pict>
+      </w:r>
+    </w:p>
+    <w:p>
+      <w:pPr>
+        <w:rPr>
+          <w:b/>
+          <w:bCs/>
+        </w:rPr>
+      </w:pPr>
+      <w:r>
+        <w:rPr>
+          <w:rFonts w:ascii="Calibri" w:eastAsia="Calibri" w:hAnsi="Calibri"/>
+          <w:b/>
+          <w:bCs/>
+        </w:rPr>
+        <w:t>Professional Service</w:t>
+      </w:r>
+    </w:p>
+    <w:p>
+      <w:pPr>
+        <w:numPr>
+          <w:ilvl w:val="0"/>
+          <w:numId w:val="33"/>
+        </w:numPr>
+      </w:pPr>
+      <w:r>
+        <w:rPr>
+          <w:rFonts w:ascii="Calibri" w:eastAsia="Calibri" w:hAnsi="Calibri"/>
+          <w:b/>
+          <w:bCs/>
+        </w:rPr>
+        <w:t>Reviewer:</w:t>
+      </w:r>
+      <w:r>
+        <w:rPr>
+          <w:rFonts w:ascii="Calibri" w:eastAsia="Calibri" w:hAnsi="Calibri"/>
+        </w:rPr>
+        <w:t xml:space="preserve"> AAAI, IJCAI, AAMAS, KDD, CHI, EC, ECAI, Group Decision &amp; Negotiation</w:t>
+      </w:r>
+    </w:p>
+    <w:p>
+      <w:pPr>
+        <w:numPr>
+          <w:ilvl w:val="0"/>
+          <w:numId w:val="33"/>
+        </w:numPr>
+      </w:pPr>
+      <w:r>
+        <w:rPr>
+          <w:rFonts w:ascii="Calibri" w:eastAsia="Calibri" w:hAnsi="Calibri"/>
+        </w:rPr>
+        <w:t>Developed voting algorithm for Best Paper selection (IAAI 2018)</w:t>
+      </w:r>
+    </w:p>
+    <w:p>
+      <w:pPr>
+        <w:numPr>
+          <w:ilvl w:val="0"/>
+          <w:numId w:val="33"/>
+        </w:numPr>
+      </w:pPr>
+      <w:r>
+        <w:rPr>
+          <w:rFonts w:ascii="Calibri" w:eastAsia="Calibri" w:hAnsi="Calibri"/>
+        </w:rPr>
+        <w:t>Organized departmental seminars at Ben-Gurion University</w:t>
+      </w:r>
+    </w:p>
+    <w:p>
+      <w:r>
+        <w:rPr>
+          <w:rFonts w:ascii="Calibri" w:eastAsia="Calibri" w:hAnsi="Calibri"/>
+        </w:rPr>
+        <w:pict w14:anchorId="46D9385D">
+          <v:rect id="_x0000_i1032" style="width:0;height:1.5pt" o:hralign="center" o:hrstd="t" o:hrnoshade="t" o:hr="t" fillcolor="gray" stroked="f"/>
+        </w:pict>
+      </w:r>
+    </w:p>
+    <w:p/>
+    <w:p>
+      <w:r>
+        <w:rPr>
+          <w:rFonts w:ascii="Calibri" w:eastAsia="Calibri" w:hAnsi="Calibri"/>
+        </w:rPr>
         <w:lastRenderedPageBreak/>
         <w:pict w14:anchorId="16542E24">
           <v:rect id="_x0000_i1033" style="width:0;height:1.5pt" o:hralign="center" o:hrstd="t" o:hrnoshade="t" o:hr="t" fillcolor="gray" stroked="f"/>
@@ -607,1246 +1766,6 @@
         <w:t>Mash, M., Rochlin, I., &amp; Sarne, D. (2012). Join Me with the Weakest Partner, Please. IAT.</w:t>
       </w:r>
     </w:p>
-    <w:p>
-      <w:r>
-        <w:rPr>
-          <w:rFonts w:ascii="Calibri" w:eastAsia="Calibri" w:hAnsi="Calibri"/>
-        </w:rPr>
-        <w:pict w14:anchorId="49F94E1B">
-          <v:rect id="_x0000_i1029" style="width:0;height:1.5pt" o:hralign="center" o:hrstd="t" o:hrnoshade="t" o:hr="t" fillcolor="gray" stroked="f"/>
-        </w:pict>
-      </w:r>
-    </w:p>
-    <w:p>
-      <w:pPr>
-        <w:rPr>
-          <w:b/>
-          <w:bCs/>
-        </w:rPr>
-      </w:pPr>
-      <w:r>
-        <w:rPr>
-          <w:rFonts w:ascii="Calibri" w:eastAsia="Calibri" w:hAnsi="Calibri"/>
-          <w:b/>
-          <w:bCs/>
-        </w:rPr>
-        <w:t>Awards &amp; Recognition</w:t>
-      </w:r>
-    </w:p>
-    <w:p>
-      <w:pPr>
-        <w:numPr>
-          <w:ilvl w:val="0"/>
-          <w:numId w:val="26"/>
-        </w:numPr>
-      </w:pPr>
-      <w:r>
-        <w:rPr>
-          <w:rFonts w:ascii="Calibri" w:eastAsia="Calibri" w:hAnsi="Calibri"/>
-          <w:b/>
-          <w:bCs/>
-        </w:rPr>
-        <w:t>Best Paper Award</w:t>
-      </w:r>
-      <w:r>
-        <w:rPr>
-          <w:rFonts w:ascii="Calibri" w:eastAsia="Calibri" w:hAnsi="Calibri"/>
-        </w:rPr>
-        <w:t xml:space="preserve"> – ACM Conference on Economics and Computation (2016)</w:t>
-      </w:r>
-    </w:p>
-    <w:p>
-      <w:pPr>
-        <w:numPr>
-          <w:ilvl w:val="0"/>
-          <w:numId w:val="26"/>
-        </w:numPr>
-      </w:pPr>
-      <w:r>
-        <w:rPr>
-          <w:rFonts w:ascii="Calibri" w:eastAsia="Calibri" w:hAnsi="Calibri"/>
-          <w:b/>
-          <w:bCs/>
-        </w:rPr>
-        <w:t>Communications of the ACM Research Highlight</w:t>
-      </w:r>
-      <w:r>
-        <w:rPr>
-          <w:rFonts w:ascii="Calibri" w:eastAsia="Calibri" w:hAnsi="Calibri"/>
-        </w:rPr>
-        <w:t xml:space="preserve"> – Which Is the Fairest (Rent Division) of Them All? (2018)</w:t>
-      </w:r>
-    </w:p>
-    <w:p>
-      <w:pPr>
-        <w:numPr>
-          <w:ilvl w:val="0"/>
-          <w:numId w:val="26"/>
-        </w:numPr>
-        <w:rPr>
-          <w:bCs/>
-        </w:rPr>
-      </w:pPr>
-      <w:r>
-        <w:rPr>
-          <w:rFonts w:ascii="Calibri" w:eastAsia="Calibri" w:hAnsi="Calibri"/>
-          <w:b/>
-          <w:bCs/>
-        </w:rPr>
-        <w:t>Excellence in Teaching Award</w:t>
-      </w:r>
-      <w:r>
-        <w:rPr>
-          <w:rFonts w:ascii="Calibri" w:eastAsia="Calibri" w:hAnsi="Calibri"/>
-          <w:b/>
-        </w:rPr>
-        <w:t xml:space="preserve"> </w:t>
-      </w:r>
-      <w:r>
-        <w:rPr>
-          <w:rFonts w:ascii="Calibri" w:eastAsia="Calibri" w:hAnsi="Calibri"/>
-          <w:bCs/>
-        </w:rPr>
-        <w:t>– Ben-Gurion University (2016, 2017)</w:t>
-      </w:r>
-    </w:p>
-    <w:p>
-      <w:pPr>
-        <w:numPr>
-          <w:ilvl w:val="0"/>
-          <w:numId w:val="26"/>
-        </w:numPr>
-      </w:pPr>
-      <w:r>
-        <w:rPr>
-          <w:rFonts w:ascii="Calibri" w:eastAsia="Calibri" w:hAnsi="Calibri"/>
-          <w:b/>
-          <w:bCs/>
-        </w:rPr>
-        <w:t>Ph.D. Scholarship for Academic Excellence</w:t>
-      </w:r>
-      <w:r>
-        <w:rPr>
-          <w:rFonts w:ascii="Calibri" w:eastAsia="Calibri" w:hAnsi="Calibri"/>
-        </w:rPr>
-        <w:t xml:space="preserve"> – Ben-Gurion University (2014)</w:t>
-      </w:r>
-    </w:p>
-    <w:p>
-      <w:r>
-        <w:rPr>
-          <w:rFonts w:ascii="Calibri" w:eastAsia="Calibri" w:hAnsi="Calibri"/>
-        </w:rPr>
-        <w:pict w14:anchorId="50DDD9F5">
-          <v:rect id="_x0000_i1026" style="width:0;height:1.5pt" o:hralign="center" o:hrstd="t" o:hrnoshade="t" o:hr="t" fillcolor="gray" stroked="f"/>
-        </w:pict>
-      </w:r>
-    </w:p>
-    <w:p>
-      <w:pPr>
-        <w:rPr>
-          <w:b/>
-          <w:bCs/>
-        </w:rPr>
-      </w:pPr>
-      <w:r>
-        <w:rPr>
-          <w:rFonts w:ascii="Calibri" w:eastAsia="Calibri" w:hAnsi="Calibri"/>
-          <w:b/>
-          <w:bCs/>
-        </w:rPr>
-        <w:t>Academic Positions</w:t>
-      </w:r>
-    </w:p>
-    <w:p>
-      <w:r>
-        <w:rPr>
-          <w:rFonts w:ascii="Calibri" w:eastAsia="Calibri" w:hAnsi="Calibri"/>
-          <w:b/>
-          <w:bCs/>
-        </w:rPr>
-        <w:t>Postdoctoral Researcher</w:t>
-      </w:r>
-      <w:r>
-        <w:rPr>
-          <w:rFonts w:ascii="Calibri" w:eastAsia="Calibri" w:hAnsi="Calibri"/>
-        </w:rPr>
-        <w:t xml:space="preserve"> | </w:t>
-      </w:r>
-      <w:r>
-        <w:rPr>
-          <w:rFonts w:ascii="Calibri" w:eastAsia="Calibri" w:hAnsi="Calibri"/>
-          <w:b/>
-          <w:bCs/>
-        </w:rPr>
-        <w:t>Carnegie Mellon University, Robotics Institute</w:t>
-      </w:r>
-      <w:r>
-        <w:rPr>
-          <w:rFonts w:ascii="Calibri" w:eastAsia="Calibri" w:hAnsi="Calibri"/>
-        </w:rPr>
-        <w:t xml:space="preserve"> | </w:t>
-      </w:r>
-      <w:r>
-        <w:rPr>
-          <w:rFonts w:ascii="Calibri" w:eastAsia="Calibri" w:hAnsi="Calibri"/>
-          <w:b/>
-          <w:bCs/>
-        </w:rPr>
-        <w:t>2019–2022</w:t>
-      </w:r>
-    </w:p>
-    <w:p>
-      <w:pPr>
-        <w:numPr>
-          <w:ilvl w:val="0"/>
-          <w:numId w:val="21"/>
-        </w:numPr>
-      </w:pPr>
-      <w:r>
-        <w:t xml:space="preserve">Hosted by </w:t>
-      </w:r>
-      <w:r>
-        <w:rPr>
-          <w:b/>
-          <w:bCs/>
-        </w:rPr>
-        <w:t>Prof. Reid Simmons</w:t>
-      </w:r>
-      <w:r>
-        <w:t xml:space="preserve"> and </w:t>
-      </w:r>
-      <w:r>
-        <w:rPr>
-          <w:b/>
-          <w:bCs/>
-        </w:rPr>
-        <w:t>Dr. Stephanie Rosenthal</w:t>
-      </w:r>
-      <w:r>
-        <w:t>.</w:t>
-      </w:r>
-    </w:p>
-    <w:p>
-      <w:pPr>
-        <w:numPr>
-          <w:ilvl w:val="0"/>
-          <w:numId w:val="22"/>
-        </w:numPr>
-      </w:pPr>
-      <w:r>
-        <w:rPr>
-          <w:rFonts w:ascii="Calibri" w:eastAsia="Calibri" w:hAnsi="Calibri"/>
-        </w:rPr>
-        <w:lastRenderedPageBreak/>
-        <w:t>Conducted research on the behavior and cognitive processes of machine learning practitioners as they develop AI models.</w:t>
-      </w:r>
-    </w:p>
-    <w:p>
-      <w:pPr>
-        <w:numPr>
-          <w:ilvl w:val="0"/>
-          <w:numId w:val="22"/>
-        </w:numPr>
-      </w:pPr>
-      <w:r>
-        <w:rPr>
-          <w:rFonts w:ascii="Calibri" w:eastAsia="Calibri" w:hAnsi="Calibri"/>
-        </w:rPr>
-        <w:t>Designed frameworks to capture, model, and analyze workflows, with emphasis on decision-making, iteration cycles, and knowledge bottlenecks.</w:t>
-      </w:r>
-    </w:p>
-    <w:p>
-      <w:pPr>
-        <w:numPr>
-          <w:ilvl w:val="0"/>
-          <w:numId w:val="22"/>
-        </w:numPr>
-      </w:pPr>
-      <w:r>
-        <w:rPr>
-          <w:rFonts w:ascii="Calibri" w:eastAsia="Calibri" w:hAnsi="Calibri"/>
-        </w:rPr>
-        <w:t>Developed predictive methods to identify critical moments of difficulty (“stuckness”) in ML development, enabling targeted support and improved productivity.</w:t>
-      </w:r>
-    </w:p>
-    <w:p>
-      <w:pPr>
-        <w:numPr>
-          <w:ilvl w:val="0"/>
-          <w:numId w:val="22"/>
-        </w:numPr>
-      </w:pPr>
-      <w:r>
-        <w:rPr>
-          <w:rFonts w:ascii="Calibri" w:eastAsia="Calibri" w:hAnsi="Calibri"/>
-        </w:rPr>
-        <w:t>Collaborated with multidisciplinary teams to integrate human-centric AI approaches into machine learning tools and environments.</w:t>
-      </w:r>
-    </w:p>
-    <w:p>
-      <w:pPr>
-        <w:numPr>
-          <w:ilvl w:val="0"/>
-          <w:numId w:val="22"/>
-        </w:numPr>
-      </w:pPr>
-      <w:r>
-        <w:rPr>
-          <w:rFonts w:ascii="Calibri" w:eastAsia="Calibri" w:hAnsi="Calibri"/>
-        </w:rPr>
-        <w:t>Mentored students in AI and human-computer interaction research.</w:t>
-      </w:r>
-    </w:p>
-    <w:p>
-      <w:pPr>
-        <w:numPr>
-          <w:ilvl w:val="0"/>
-          <w:numId w:val="22"/>
-        </w:numPr>
-      </w:pPr>
-      <w:r>
-        <w:rPr>
-          <w:rFonts w:ascii="Calibri" w:eastAsia="Calibri" w:hAnsi="Calibri"/>
-        </w:rPr>
-        <w:t>Research funded by J.P. Morgan, which renewed the award for a second consecutive year based on the project's strong results.</w:t>
-      </w:r>
-    </w:p>
-    <w:p>
-      <w:r>
-        <w:rPr>
-          <w:rFonts w:ascii="Calibri" w:eastAsia="Calibri" w:hAnsi="Calibri"/>
-          <w:b/>
-          <w:bCs/>
-        </w:rPr>
-        <w:t>Research Assistant</w:t>
-      </w:r>
-      <w:r>
-        <w:rPr>
-          <w:rFonts w:ascii="Calibri" w:eastAsia="Calibri" w:hAnsi="Calibri"/>
-        </w:rPr>
-        <w:t xml:space="preserve"> | </w:t>
-      </w:r>
-      <w:r>
-        <w:rPr>
-          <w:rFonts w:ascii="Calibri" w:eastAsia="Calibri" w:hAnsi="Calibri"/>
-          <w:b/>
-          <w:bCs/>
-        </w:rPr>
-        <w:t>Weizmann Institute of Science</w:t>
-      </w:r>
-      <w:r>
-        <w:rPr>
-          <w:rFonts w:ascii="Calibri" w:eastAsia="Calibri" w:hAnsi="Calibri"/>
-        </w:rPr>
-        <w:t xml:space="preserve"> | </w:t>
-      </w:r>
-      <w:r>
-        <w:rPr>
-          <w:rFonts w:ascii="Calibri" w:eastAsia="Calibri" w:hAnsi="Calibri"/>
-          <w:b/>
-          <w:bCs/>
-        </w:rPr>
-        <w:t>2011–2012</w:t>
-      </w:r>
-    </w:p>
-    <w:p>
-      <w:pPr>
-        <w:numPr>
-          <w:ilvl w:val="0"/>
-          <w:numId w:val="23"/>
-        </w:numPr>
-      </w:pPr>
-      <w:r>
-        <w:rPr>
-          <w:rFonts w:ascii="Calibri" w:eastAsia="Calibri" w:hAnsi="Calibri"/>
-        </w:rPr>
-        <w:t>Developed image-processing algorithms for 3D biomedical images.</w:t>
-      </w:r>
-    </w:p>
-    <w:p>
-      <w:r>
-        <w:rPr>
-          <w:rFonts w:ascii="Calibri" w:eastAsia="Calibri" w:hAnsi="Calibri"/>
-        </w:rPr>
-        <w:pict w14:anchorId="69FF5FEC">
-          <v:rect id="_x0000_i1027" style="width:0;height:1.5pt" o:hralign="center" o:hrstd="t" o:hrnoshade="t" o:hr="t" fillcolor="gray" stroked="f"/>
-        </w:pict>
-      </w:r>
-    </w:p>
-    <w:p>
-      <w:pPr>
-        <w:rPr>
-          <w:b/>
-          <w:bCs/>
-        </w:rPr>
-      </w:pPr>
-      <w:r>
-        <w:rPr>
-          <w:rFonts w:ascii="Calibri" w:eastAsia="Calibri" w:hAnsi="Calibri"/>
-          <w:b/>
-          <w:bCs/>
-        </w:rPr>
-        <w:t>Industry Research Positions</w:t>
-      </w:r>
-    </w:p>
-    <w:p>
-      <w:pPr>
-        <w:rPr>
-          <w:b/>
-          <w:bCs/>
-        </w:rPr>
-      </w:pPr>
-      <w:r>
-        <w:rPr>
-          <w:b/>
-          <w:bCs/>
-        </w:rPr>
-        <w:t>Principal AI Researcher &amp; Founder | MashInnovateAI | 2024–present</w:t>
-      </w:r>
-    </w:p>
-    <w:p>
-      <w:pPr>
-        <w:numPr>
-          <w:ilvl w:val="0"/>
-          <w:numId w:val="21"/>
-        </w:numPr>
-      </w:pPr>
-      <w:r>
-        <w:t>Independent AI research &amp; development consultancy delivering end-to-end custom AI systems — NLP, LLM fine-tuning, RAG, agentic and multi-agent LLM systems, and applied ML — from proof of concept to production deployment for research and industry partners.</w:t>
-      </w:r>
-    </w:p>
-    <w:p>
-      <w:pPr>
-        <w:numPr>
-          <w:ilvl w:val="0"/>
-          <w:numId w:val="21"/>
-        </w:numPr>
-      </w:pPr>
-      <w:r>
-        <w:t xml:space="preserve">Clients include startups, established companies looking to integrate AI into their products and workflows, and universities and academic research groups.</w:t>
-      </w:r>
-    </w:p>
-    <w:p>
-      <w:pPr>
-        <w:rPr>
-          <w:b/>
-          <w:bCs/>
-        </w:rPr>
-      </w:pPr>
-      <w:r>
-        <w:rPr>
-          <w:b/>
-          <w:bCs/>
-        </w:rPr>
-        <w:t>AI Researcher | DICTA – The Israel Center for Text Analysis | 2022–present</w:t>
-      </w:r>
-    </w:p>
-    <w:p>
-      <w:pPr>
-        <w:numPr>
-          <w:ilvl w:val="0"/>
-          <w:numId w:val="21"/>
-        </w:numPr>
-      </w:pPr>
-      <w:r>
-        <w:rPr>
-          <w:rFonts w:ascii="Calibri" w:eastAsia="Calibri" w:hAnsi="Calibri"/>
-        </w:rPr>
-        <w:t>Conduct research at the intersection of computational linguistics and Jewish studies, focusing on rabbinical and modern Hebrew.</w:t>
-      </w:r>
-    </w:p>
-    <w:p>
-      <w:pPr>
-        <w:numPr>
-          <w:ilvl w:val="0"/>
-          <w:numId w:val="21"/>
-        </w:numPr>
-      </w:pPr>
-      <w:r>
-        <w:rPr>
-          <w:rFonts w:ascii="Calibri" w:eastAsia="Calibri" w:hAnsi="Calibri"/>
-        </w:rPr>
-        <w:lastRenderedPageBreak/>
-        <w:t>Developed NLP pipelines for authorship attribution, including models predicting the rabbi/author of texts where attribution is disputed.</w:t>
-      </w:r>
-    </w:p>
-    <w:p>
-      <w:pPr>
-        <w:numPr>
-          <w:ilvl w:val="0"/>
-          <w:numId w:val="21"/>
-        </w:numPr>
-      </w:pPr>
-      <w:r>
-        <w:rPr>
-          <w:rFonts w:ascii="Calibri" w:eastAsia="Calibri" w:hAnsi="Calibri"/>
-        </w:rPr>
-        <w:t>Achieved high predictive accuracy and used these models to weigh in on long-debated questions of authorship in classical Jewish texts — determining the likely author of works whose attribution had been disputed in traditional scholarship.</w:t>
-      </w:r>
-    </w:p>
-    <w:p>
-      <w:pPr>
-        <w:numPr>
-          <w:ilvl w:val="0"/>
-          <w:numId w:val="21"/>
-        </w:numPr>
-      </w:pPr>
-      <w:r>
-        <w:rPr>
-          <w:rFonts w:ascii="Calibri" w:eastAsia="Calibri" w:hAnsi="Calibri"/>
-        </w:rPr>
-        <w:t>Designed AI-driven systems for automatic citation generation and cross-referencing of classical sources.</w:t>
-      </w:r>
-    </w:p>
-    <w:p>
-      <w:pPr>
-        <w:numPr>
-          <w:ilvl w:val="0"/>
-          <w:numId w:val="21"/>
-        </w:numPr>
-      </w:pPr>
-      <w:r>
-        <w:rPr>
-          <w:rFonts w:ascii="Calibri" w:eastAsia="Calibri" w:hAnsi="Calibri"/>
-        </w:rPr>
-        <w:t>Built advanced machine learning and LLM-based tools to support scholarly research in Hebrew texts, integrating prediction, text similarity, and semantic analysis.</w:t>
-      </w:r>
-    </w:p>
-    <w:p>
-      <w:pPr>
-        <w:numPr>
-          <w:ilvl w:val="0"/>
-          <w:numId w:val="21"/>
-        </w:numPr>
-      </w:pPr>
-      <w:r>
-        <w:rPr>
-          <w:rFonts w:ascii="Calibri" w:eastAsia="Calibri" w:hAnsi="Calibri"/>
-        </w:rPr>
-        <w:t>Took models from research through to production deployment, delivering systems that are actively used by scholars and researchers for live analysis of Hebrew texts.</w:t>
-      </w:r>
-    </w:p>
-    <w:p>
-      <w:pPr>
-        <w:numPr>
-          <w:ilvl w:val="0"/>
-          <w:numId w:val="21"/>
-        </w:numPr>
-      </w:pPr>
-      <w:r>
-        <w:rPr>
-          <w:rFonts w:ascii="Calibri" w:eastAsia="Calibri" w:hAnsi="Calibri"/>
-        </w:rPr>
-        <w:t>Published prototypes and tools provided academic collaborators with tools enabling automated scholarly insights.</w:t>
-      </w:r>
-    </w:p>
-    <w:p>
-      <w:r>
-        <w:rPr>
-          <w:rFonts w:ascii="Calibri" w:eastAsia="Calibri" w:hAnsi="Calibri"/>
-          <w:b/>
-          <w:bCs/>
-        </w:rPr>
-        <w:t>AI Researcher</w:t>
-      </w:r>
-      <w:r>
-        <w:rPr>
-          <w:rFonts w:ascii="Calibri" w:eastAsia="Calibri" w:hAnsi="Calibri"/>
-        </w:rPr>
-        <w:t xml:space="preserve"> | </w:t>
-      </w:r>
-      <w:r>
-        <w:rPr>
-          <w:rFonts w:ascii="Calibri" w:eastAsia="Calibri" w:hAnsi="Calibri"/>
-          <w:b/>
-          <w:bCs/>
-        </w:rPr>
-        <w:t>Diagnostic Robotics</w:t>
-      </w:r>
-      <w:r>
-        <w:rPr>
-          <w:rFonts w:ascii="Calibri" w:eastAsia="Calibri" w:hAnsi="Calibri"/>
-        </w:rPr>
-        <w:t xml:space="preserve"> | </w:t>
-      </w:r>
-      <w:r>
-        <w:rPr>
-          <w:rFonts w:ascii="Calibri" w:eastAsia="Calibri" w:hAnsi="Calibri"/>
-          <w:b/>
-          <w:bCs/>
-        </w:rPr>
-        <w:t>2019</w:t>
-      </w:r>
-    </w:p>
-    <w:p>
-      <w:pPr>
-        <w:numPr>
-          <w:ilvl w:val="0"/>
-          <w:numId w:val="24"/>
-        </w:numPr>
-      </w:pPr>
-      <w:r>
-        <w:rPr>
-          <w:rFonts w:ascii="Calibri" w:eastAsia="Calibri" w:hAnsi="Calibri"/>
-        </w:rPr>
-        <w:t>Developed machine learning models for the healthcare domain, with applications in risk prediction (e.g., ER diagnoses, hospitalization forecasting).</w:t>
-      </w:r>
-    </w:p>
-    <w:p>
-      <w:pPr>
-        <w:numPr>
-          <w:ilvl w:val="0"/>
-          <w:numId w:val="24"/>
-        </w:numPr>
-      </w:pPr>
-      <w:r>
-        <w:rPr>
-          <w:rFonts w:ascii="Calibri" w:eastAsia="Calibri" w:hAnsi="Calibri"/>
-        </w:rPr>
-        <w:t>Collaborated with clinicians and researchers to refine AI-driven predictive healthcare decision-support systems.</w:t>
-      </w:r>
-    </w:p>
-    <w:p>
-      <w:pPr>
-        <w:numPr>
-          <w:ilvl w:val="0"/>
-          <w:numId w:val="21"/>
-        </w:numPr>
-      </w:pPr>
-      <w:r>
-        <w:t>Tech stack: Python, scikit-learn, and clinical/EHR data pipelines.</w:t>
-      </w:r>
-    </w:p>
-    <w:p>
-      <w:r>
-        <w:rPr>
-          <w:rFonts w:ascii="Calibri" w:eastAsia="Calibri" w:hAnsi="Calibri"/>
-          <w:b/>
-          <w:bCs/>
-        </w:rPr>
-        <w:t>AI Researcher</w:t>
-      </w:r>
-      <w:r>
-        <w:rPr>
-          <w:rFonts w:ascii="Calibri" w:eastAsia="Calibri" w:hAnsi="Calibri"/>
-        </w:rPr>
-        <w:t xml:space="preserve"> | </w:t>
-      </w:r>
-      <w:r>
-        <w:rPr>
-          <w:rFonts w:ascii="Calibri" w:eastAsia="Calibri" w:hAnsi="Calibri"/>
-          <w:b/>
-          <w:bCs/>
-        </w:rPr>
-        <w:t>Amdocs</w:t>
-      </w:r>
-      <w:r>
-        <w:rPr>
-          <w:rFonts w:ascii="Calibri" w:eastAsia="Calibri" w:hAnsi="Calibri"/>
-        </w:rPr>
-        <w:t xml:space="preserve"> | </w:t>
-      </w:r>
-      <w:r>
-        <w:rPr>
-          <w:rFonts w:ascii="Calibri" w:eastAsia="Calibri" w:hAnsi="Calibri"/>
-          <w:b/>
-          <w:bCs/>
-        </w:rPr>
-        <w:t>2018–2019</w:t>
-      </w:r>
-    </w:p>
-    <w:p>
-      <w:pPr>
-        <w:numPr>
-          <w:ilvl w:val="0"/>
-          <w:numId w:val="25"/>
-        </w:numPr>
-      </w:pPr>
-      <w:r>
-        <w:rPr>
-          <w:rFonts w:ascii="Calibri" w:eastAsia="Calibri" w:hAnsi="Calibri"/>
-        </w:rPr>
-        <w:t>Led the development of an innovative system predicting at-risk maintenance contract renewals, saving the company millions of dollars and still in operational use years later.</w:t>
-      </w:r>
-    </w:p>
-    <w:p>
-      <w:pPr>
-        <w:numPr>
-          <w:ilvl w:val="0"/>
-          <w:numId w:val="25"/>
-        </w:numPr>
-      </w:pPr>
-      <w:r>
-        <w:rPr>
-          <w:rFonts w:ascii="Calibri" w:eastAsia="Calibri" w:hAnsi="Calibri"/>
-        </w:rPr>
-        <w:t>Designed, built, and deployed the system from scratch, including problem definition, algorithm design, evaluation, and deployment pipeline.</w:t>
-      </w:r>
-    </w:p>
-    <w:p>
-      <w:pPr>
-        <w:numPr>
-          <w:ilvl w:val="0"/>
-          <w:numId w:val="21"/>
-        </w:numPr>
-      </w:pPr>
-      <w:r>
-        <w:t>Tech stack: Python, scikit-learn, SQL, and a production deployment pipeline.</w:t>
-      </w:r>
-    </w:p>
-    <w:p>
-      <w:r>
-        <w:rPr>
-          <w:rFonts w:ascii="Calibri" w:eastAsia="Calibri" w:hAnsi="Calibri"/>
-        </w:rPr>
-        <w:pict w14:anchorId="7C3638CC">
-          <v:rect id="_x0000_i1030" style="width:0;height:1.5pt" o:hralign="center" o:hrstd="t" o:hrnoshade="t" o:hr="t" fillcolor="gray" stroked="f"/>
-        </w:pict>
-      </w:r>
-    </w:p>
-    <w:p>
-      <w:pPr>
-        <w:rPr>
-          <w:b/>
-          <w:bCs/>
-        </w:rPr>
-      </w:pPr>
-      <w:r>
-        <w:rPr>
-          <w:rFonts w:ascii="Calibri" w:eastAsia="Calibri" w:hAnsi="Calibri"/>
-          <w:b/>
-          <w:bCs/>
-        </w:rPr>
-        <w:t>Teaching &amp; Advising</w:t>
-      </w:r>
-    </w:p>
-    <w:p>
-      <w:r>
-        <w:rPr>
-          <w:rFonts w:ascii="Calibri" w:eastAsia="Calibri" w:hAnsi="Calibri"/>
-          <w:b/>
-          <w:bCs/>
-        </w:rPr>
-        <w:t>Ben-Gurion University of the Negev – Software and Information Systems Engineering Dept.</w:t>
-      </w:r>
-    </w:p>
-    <w:p>
-      <w:pPr>
-        <w:numPr>
-          <w:ilvl w:val="0"/>
-          <w:numId w:val="27"/>
-        </w:numPr>
-        <w:rPr>
-          <w:bCs/>
-        </w:rPr>
-      </w:pPr>
-      <w:r>
-        <w:rPr>
-          <w:rFonts w:ascii="Calibri" w:eastAsia="Calibri" w:hAnsi="Calibri"/>
-          <w:bCs/>
-        </w:rPr>
-        <w:t>Teaching Assistant, Databases – Fall–Spring 2016, 2017, 2018</w:t>
-      </w:r>
-    </w:p>
-    <w:p>
-      <w:pPr>
-        <w:numPr>
-          <w:ilvl w:val="0"/>
-          <w:numId w:val="27"/>
-        </w:numPr>
-        <w:rPr>
-          <w:bCs/>
-        </w:rPr>
-      </w:pPr>
-      <w:r>
-        <w:rPr>
-          <w:rFonts w:ascii="Calibri" w:eastAsia="Calibri" w:hAnsi="Calibri"/>
-          <w:bCs/>
-        </w:rPr>
-        <w:t>Teaching Assistant, Analysis and Design of Software Systems – Spring–Summer 2016, 2017, 2018</w:t>
-      </w:r>
-    </w:p>
-    <w:p>
-      <w:pPr>
-        <w:numPr>
-          <w:ilvl w:val="0"/>
-          <w:numId w:val="27"/>
-        </w:numPr>
-        <w:rPr>
-          <w:bCs/>
-        </w:rPr>
-      </w:pPr>
-      <w:r>
-        <w:rPr>
-          <w:rFonts w:ascii="Calibri" w:eastAsia="Calibri" w:hAnsi="Calibri"/>
-          <w:bCs/>
-        </w:rPr>
-        <w:t>Teaching Assistant, Intelligent Systems – Spring–Summer 2015</w:t>
-      </w:r>
-    </w:p>
-    <w:p>
-      <w:pPr>
-        <w:numPr>
-          <w:ilvl w:val="0"/>
-          <w:numId w:val="27"/>
-        </w:numPr>
-        <w:rPr>
-          <w:bCs/>
-        </w:rPr>
-      </w:pPr>
-      <w:r>
-        <w:rPr>
-          <w:rFonts w:ascii="Calibri" w:eastAsia="Calibri" w:hAnsi="Calibri"/>
-          <w:bCs/>
-        </w:rPr>
-        <w:t>Teaching Assistant, Decision Support Systems – Fall–Spring 2015</w:t>
-      </w:r>
-    </w:p>
-    <w:p>
-      <w:pPr>
-        <w:numPr>
-          <w:ilvl w:val="0"/>
-          <w:numId w:val="27"/>
-        </w:numPr>
-      </w:pPr>
-      <w:r>
-        <w:rPr>
-          <w:rFonts w:ascii="Calibri" w:eastAsia="Calibri" w:hAnsi="Calibri"/>
-        </w:rPr>
-        <w:t>Departmental Seminar Coordinator – 2015, 2016, 2017, 2018</w:t>
-      </w:r>
-    </w:p>
-    <w:p>
-      <w:pPr>
-        <w:numPr>
-          <w:ilvl w:val="0"/>
-          <w:numId w:val="27"/>
-        </w:numPr>
-      </w:pPr>
-      <w:r>
-        <w:rPr>
-          <w:rFonts w:ascii="Calibri" w:eastAsia="Calibri" w:hAnsi="Calibri"/>
-        </w:rPr>
-        <w:t>Final Projects Coordinator (4th Year) – 2015, 2016, 2017, 2018</w:t>
-      </w:r>
-    </w:p>
-    <w:p>
-      <w:pPr>
-        <w:numPr>
-          <w:ilvl w:val="0"/>
-          <w:numId w:val="27"/>
-        </w:numPr>
-      </w:pPr>
-      <w:r>
-        <w:rPr>
-          <w:rFonts w:ascii="Calibri" w:eastAsia="Calibri" w:hAnsi="Calibri"/>
-        </w:rPr>
-        <w:t>Final Projects Adviser (Undergraduate) – 2015, 2016</w:t>
-      </w:r>
-    </w:p>
-    <w:p>
-      <w:r>
-        <w:rPr>
-          <w:rFonts w:ascii="Calibri" w:eastAsia="Calibri" w:hAnsi="Calibri"/>
-          <w:b/>
-          <w:bCs/>
-        </w:rPr>
-        <w:t>Tel-Aviv Yafo Academic College – Information Systems Dept.</w:t>
-      </w:r>
-    </w:p>
-    <w:p>
-      <w:pPr>
-        <w:numPr>
-          <w:ilvl w:val="0"/>
-          <w:numId w:val="28"/>
-        </w:numPr>
-      </w:pPr>
-      <w:r>
-        <w:rPr>
-          <w:rFonts w:ascii="Calibri" w:eastAsia="Calibri" w:hAnsi="Calibri"/>
-        </w:rPr>
-        <w:t>Professor, Databases – Spring–Summer 2015, Fall–Spring 2015</w:t>
-      </w:r>
-    </w:p>
-    <w:p>
-      <w:pPr>
-        <w:numPr>
-          <w:ilvl w:val="0"/>
-          <w:numId w:val="28"/>
-        </w:numPr>
-      </w:pPr>
-      <w:r>
-        <w:rPr>
-          <w:rFonts w:ascii="Calibri" w:eastAsia="Calibri" w:hAnsi="Calibri"/>
-        </w:rPr>
-        <w:lastRenderedPageBreak/>
-        <w:t>Lecturer, Game Theory – Spring–Summer 2015</w:t>
-      </w:r>
-    </w:p>
-    <w:p>
-      <w:pPr>
-        <w:numPr>
-          <w:ilvl w:val="0"/>
-          <w:numId w:val="28"/>
-        </w:numPr>
-        <w:rPr>
-          <w:bCs/>
-        </w:rPr>
-      </w:pPr>
-      <w:r>
-        <w:rPr>
-          <w:rFonts w:ascii="Calibri" w:eastAsia="Calibri" w:hAnsi="Calibri"/>
-          <w:bCs/>
-        </w:rPr>
-        <w:t>Teaching Assistant, Databases – Spring–Summer 2014</w:t>
-      </w:r>
-    </w:p>
-    <w:p>
-      <w:r>
-        <w:rPr>
-          <w:rFonts w:ascii="Calibri" w:eastAsia="Calibri" w:hAnsi="Calibri"/>
-          <w:b/>
-          <w:bCs/>
-        </w:rPr>
-        <w:t>Bar-Ilan University</w:t>
-      </w:r>
-    </w:p>
-    <w:p>
-      <w:pPr>
-        <w:numPr>
-          <w:ilvl w:val="0"/>
-          <w:numId w:val="29"/>
-        </w:numPr>
-        <w:rPr>
-          <w:bCs/>
-        </w:rPr>
-      </w:pPr>
-      <w:r>
-        <w:rPr>
-          <w:rFonts w:ascii="Calibri" w:eastAsia="Calibri" w:hAnsi="Calibri"/>
-          <w:bCs/>
-        </w:rPr>
-        <w:t>Teaching Assistant, Statistical Methods in Computer Science – Spring–Summer 2014</w:t>
-      </w:r>
-    </w:p>
-    <w:p>
-      <w:pPr>
-        <w:numPr>
-          <w:ilvl w:val="0"/>
-          <w:numId w:val="29"/>
-        </w:numPr>
-        <w:rPr>
-          <w:bCs/>
-        </w:rPr>
-      </w:pPr>
-      <w:r>
-        <w:rPr>
-          <w:rFonts w:ascii="Calibri" w:eastAsia="Calibri" w:hAnsi="Calibri"/>
-          <w:bCs/>
-        </w:rPr>
-        <w:t>Teaching Assistant, Object-Oriented Programming – Fall–Spring 2013, 2014</w:t>
-      </w:r>
-    </w:p>
-    <w:p>
-      <w:pPr>
-        <w:numPr>
-          <w:ilvl w:val="0"/>
-          <w:numId w:val="29"/>
-        </w:numPr>
-        <w:rPr>
-          <w:bCs/>
-        </w:rPr>
-      </w:pPr>
-      <w:r>
-        <w:rPr>
-          <w:rFonts w:ascii="Calibri" w:eastAsia="Calibri" w:hAnsi="Calibri"/>
-          <w:bCs/>
-        </w:rPr>
-        <w:t>Teaching Assistant, Machine Learning – Fall–Spring 2014</w:t>
-      </w:r>
-    </w:p>
-    <w:p>
-      <w:pPr>
-        <w:numPr>
-          <w:ilvl w:val="0"/>
-          <w:numId w:val="29"/>
-        </w:numPr>
-        <w:rPr>
-          <w:bCs/>
-        </w:rPr>
-      </w:pPr>
-      <w:r>
-        <w:rPr>
-          <w:rFonts w:ascii="Calibri" w:eastAsia="Calibri" w:hAnsi="Calibri"/>
-          <w:bCs/>
-        </w:rPr>
-        <w:t>Teaching Assistant, Introduction to Computing – Fall–Spring 2013</w:t>
-      </w:r>
-    </w:p>
-    <w:p>
-      <w:r>
-        <w:rPr>
-          <w:rFonts w:ascii="Calibri" w:eastAsia="Calibri" w:hAnsi="Calibri"/>
-          <w:b/>
-          <w:bCs/>
-        </w:rPr>
-        <w:t>Shenkar College of Engineering and Design</w:t>
-      </w:r>
-    </w:p>
-    <w:p>
-      <w:pPr>
-        <w:numPr>
-          <w:ilvl w:val="0"/>
-          <w:numId w:val="30"/>
-        </w:numPr>
-        <w:rPr>
-          <w:bCs/>
-        </w:rPr>
-      </w:pPr>
-      <w:r>
-        <w:rPr>
-          <w:rFonts w:ascii="Calibri" w:eastAsia="Calibri" w:hAnsi="Calibri"/>
-          <w:bCs/>
-        </w:rPr>
-        <w:t>Teaching Assistant, Introduction to Programming Systems – Spring–Summer 2012</w:t>
-      </w:r>
-    </w:p>
-    <w:p>
-      <w:pPr>
-        <w:numPr>
-          <w:ilvl w:val="0"/>
-          <w:numId w:val="30"/>
-        </w:numPr>
-        <w:rPr>
-          <w:bCs/>
-        </w:rPr>
-      </w:pPr>
-      <w:r>
-        <w:rPr>
-          <w:rFonts w:ascii="Calibri" w:eastAsia="Calibri" w:hAnsi="Calibri"/>
-          <w:bCs/>
-        </w:rPr>
-        <w:t>Teaching Assistant, Introduction to Computer Science – Fall–Spring 2012</w:t>
-      </w:r>
-    </w:p>
-    <w:p>
-      <w:pPr>
-        <w:numPr>
-          <w:ilvl w:val="0"/>
-          <w:numId w:val="30"/>
-        </w:numPr>
-        <w:rPr>
-          <w:bCs/>
-        </w:rPr>
-      </w:pPr>
-      <w:r>
-        <w:rPr>
-          <w:rFonts w:ascii="Calibri" w:eastAsia="Calibri" w:hAnsi="Calibri"/>
-          <w:bCs/>
-        </w:rPr>
-        <w:t>Teaching Assistant, Introduction to Object-Oriented Programming – Fall–Spring 2012</w:t>
-      </w:r>
-    </w:p>
-    <w:p>
-      <w:r>
-        <w:rPr>
-          <w:rFonts w:ascii="Calibri" w:eastAsia="Calibri" w:hAnsi="Calibri"/>
-          <w:b/>
-          <w:bCs/>
-        </w:rPr>
-        <w:t>College of Management (Academic)</w:t>
-      </w:r>
-    </w:p>
-    <w:p>
-      <w:pPr>
-        <w:numPr>
-          <w:ilvl w:val="0"/>
-          <w:numId w:val="31"/>
-        </w:numPr>
-        <w:rPr>
-          <w:bCs/>
-        </w:rPr>
-      </w:pPr>
-      <w:r>
-        <w:rPr>
-          <w:rFonts w:ascii="Calibri" w:eastAsia="Calibri" w:hAnsi="Calibri"/>
-          <w:bCs/>
-        </w:rPr>
-        <w:t>Teaching Assistant, Object-Oriented Programming – Spring–Summer 2012</w:t>
-      </w:r>
-    </w:p>
-    <w:p>
-      <w:pPr>
-        <w:rPr>
-          <w:b/>
-          <w:bCs/>
-        </w:rPr>
-      </w:pPr>
-      <w:r>
-        <w:rPr>
-          <w:rFonts w:ascii="Calibri" w:eastAsia="Calibri" w:hAnsi="Calibri"/>
-          <w:b/>
-          <w:bCs/>
-        </w:rPr>
-        <w:t>High School Teaching (Israel Ministry of Education)</w:t>
-      </w:r>
-    </w:p>
-    <w:p>
-      <w:pPr>
-        <w:numPr>
-          <w:ilvl w:val="0"/>
-          <w:numId w:val="32"/>
-        </w:numPr>
-      </w:pPr>
-      <w:r>
-        <w:rPr>
-          <w:rFonts w:ascii="Calibri" w:eastAsia="Calibri" w:hAnsi="Calibri"/>
-        </w:rPr>
-        <w:t>Mathematics Teacher (2010–2013) – taught Bagrut levels 3–5 points, specializing in students with learning disabilities (via Nitzan Association).</w:t>
-      </w:r>
-    </w:p>
-    <w:p>
-      <w:r>
-        <w:rPr>
-          <w:rFonts w:ascii="Calibri" w:eastAsia="Calibri" w:hAnsi="Calibri"/>
-        </w:rPr>
-        <w:pict w14:anchorId="472DE5E4">
-          <v:rect id="_x0000_i1031" style="width:0;height:1.5pt" o:hralign="center" o:hrstd="t" o:hrnoshade="t" o:hr="t" fillcolor="gray" stroked="f"/>
-        </w:pict>
-      </w:r>
-    </w:p>
-    <w:p>
-      <w:pPr>
-        <w:rPr>
-          <w:b/>
-          <w:bCs/>
-        </w:rPr>
-      </w:pPr>
-      <w:r>
-        <w:rPr>
-          <w:rFonts w:ascii="Calibri" w:eastAsia="Calibri" w:hAnsi="Calibri"/>
-          <w:b/>
-          <w:bCs/>
-        </w:rPr>
-        <w:t>Professional Service</w:t>
-      </w:r>
-    </w:p>
-    <w:p>
-      <w:pPr>
-        <w:numPr>
-          <w:ilvl w:val="0"/>
-          <w:numId w:val="33"/>
-        </w:numPr>
-      </w:pPr>
-      <w:r>
-        <w:rPr>
-          <w:rFonts w:ascii="Calibri" w:eastAsia="Calibri" w:hAnsi="Calibri"/>
-          <w:b/>
-          <w:bCs/>
-        </w:rPr>
-        <w:t>Reviewer:</w:t>
-      </w:r>
-      <w:r>
-        <w:rPr>
-          <w:rFonts w:ascii="Calibri" w:eastAsia="Calibri" w:hAnsi="Calibri"/>
-        </w:rPr>
-        <w:t xml:space="preserve"> AAAI, IJCAI, AAMAS, KDD, CHI, EC, ECAI, Group Decision &amp; Negotiation</w:t>
-      </w:r>
-    </w:p>
-    <w:p>
-      <w:pPr>
-        <w:numPr>
-          <w:ilvl w:val="0"/>
-          <w:numId w:val="33"/>
-        </w:numPr>
-      </w:pPr>
-      <w:r>
-        <w:rPr>
-          <w:rFonts w:ascii="Calibri" w:eastAsia="Calibri" w:hAnsi="Calibri"/>
-        </w:rPr>
-        <w:t>Developed voting algorithm for Best Paper selection (IAAI 2018)</w:t>
-      </w:r>
-    </w:p>
-    <w:p>
-      <w:pPr>
-        <w:numPr>
-          <w:ilvl w:val="0"/>
-          <w:numId w:val="33"/>
-        </w:numPr>
-      </w:pPr>
-      <w:r>
-        <w:rPr>
-          <w:rFonts w:ascii="Calibri" w:eastAsia="Calibri" w:hAnsi="Calibri"/>
-        </w:rPr>
-        <w:t>Organized departmental seminars at Ben-Gurion University</w:t>
-      </w:r>
-    </w:p>
-    <w:p>
-      <w:r>
-        <w:rPr>
-          <w:rFonts w:ascii="Calibri" w:eastAsia="Calibri" w:hAnsi="Calibri"/>
-        </w:rPr>
-        <w:pict w14:anchorId="46D9385D">
-          <v:rect id="_x0000_i1032" style="width:0;height:1.5pt" o:hralign="center" o:hrstd="t" o:hrnoshade="t" o:hr="t" fillcolor="gray" stroked="f"/>
-        </w:pict>
-      </w:r>
-    </w:p>
-    <w:p>
-      <w:pPr>
-        <w:rPr>
-          <w:b/>
-          <w:bCs/>
-        </w:rPr>
-      </w:pPr>
-      <w:r>
-        <w:rPr>
-          <w:rFonts w:ascii="Calibri" w:eastAsia="Calibri" w:hAnsi="Calibri"/>
-          <w:b/>
-          <w:bCs/>
-        </w:rPr>
-        <w:t>Military Service</w:t>
-      </w:r>
-    </w:p>
-    <w:p>
-      <w:r>
-        <w:rPr>
-          <w:rFonts w:ascii="Calibri" w:eastAsia="Calibri" w:hAnsi="Calibri"/>
-          <w:b/>
-          <w:bCs/>
-        </w:rPr>
-        <w:t>Israel Defense Forces (2004–2007)</w:t>
-      </w:r>
-    </w:p>
-    <w:p>
-      <w:pPr>
-        <w:numPr>
-          <w:ilvl w:val="0"/>
-          <w:numId w:val="34"/>
-        </w:numPr>
-      </w:pPr>
-      <w:r>
-        <w:rPr>
-          <w:rFonts w:ascii="Calibri" w:eastAsia="Calibri" w:hAnsi="Calibri"/>
-        </w:rPr>
-        <w:t>Infantry Special Forces (89th Commando Brigade)</w:t>
-      </w:r>
-    </w:p>
-    <w:p>
-      <w:pPr>
-        <w:numPr>
-          <w:ilvl w:val="0"/>
-          <w:numId w:val="34"/>
-        </w:numPr>
-      </w:pPr>
-      <w:r>
-        <w:rPr>
-          <w:rFonts w:ascii="Calibri" w:eastAsia="Calibri" w:hAnsi="Calibri"/>
-        </w:rPr>
-        <w:t>Developed internal qualification &amp; operations management system</w:t>
-      </w:r>
-    </w:p>
-    <w:p/>
     <w:sectPr>
       <w:pgSz w:w="12240" w:h="15840"/>
       <w:pgMar w:top="1440" w:right="1440" w:bottom="1440" w:left="1440" w:header="720" w:footer="720" w:gutter="0"/>
@@ -8391,7 +8310,7 @@
     </a:clrScheme>
     <a:fontScheme name="Office">
       <a:majorFont>
-        <a:latin typeface="Aptos Display" panose="02110004020202020204"/>
+        <a:latin typeface="Calibri" panose="02110004020202020204"/>
         <a:ea typeface=""/>
         <a:cs typeface=""/>
         <a:font script="Jpan" typeface="游ゴシック Light"/>
@@ -8443,7 +8362,7 @@
         <a:font script="Tfng" typeface="Ebrima"/>
       </a:majorFont>
       <a:minorFont>
-        <a:latin typeface="Aptos" panose="02110004020202020204"/>
+        <a:latin typeface="Calibri" panose="02110004020202020204"/>
         <a:ea typeface=""/>
         <a:cs typeface=""/>
         <a:font script="Jpan" typeface="游ゴシック"/>

</xml_diff>